<commit_message>
Update Daniela resume and add Office temp file
Replace assets/Daniela-Resume_23_01_26.docx with an updated binary and add Microsoft Office temporary file assets/Daniela-Resume_23_01_26.docx. The added ~$ file appears to be an editor lock/temp file; consider removing it and adding a rule to .gitignore to prevent accidental commits.
</commit_message>
<xml_diff>
--- a/assets/Daniela-Resume_23_01_26.docx
+++ b/assets/Daniela-Resume_23_01_26.docx
@@ -6,6 +6,7 @@
       <w:pPr>
         <w:spacing w:after="620"/>
         <w:rPr>
+          <w:rStyle w:val="SubtleEmphasis"/>
           <w:lang w:val="pt-PT"/>
         </w:rPr>
       </w:pPr>
@@ -1288,9 +1289,9 @@
         <w:tblLook w:val="04A0" w:firstRow="1" w:lastRow="0" w:firstColumn="1" w:lastColumn="0" w:noHBand="0" w:noVBand="1"/>
       </w:tblPr>
       <w:tblGrid>
-        <w:gridCol w:w="1552"/>
-        <w:gridCol w:w="1148"/>
-        <w:gridCol w:w="5725"/>
+        <w:gridCol w:w="1391"/>
+        <w:gridCol w:w="1873"/>
+        <w:gridCol w:w="5554"/>
       </w:tblGrid>
       <w:tr>
         <w:trPr>
@@ -1961,7 +1962,6 @@
           <w:p>
             <w:pPr>
               <w:spacing w:after="310" w:line="259" w:lineRule="auto"/>
-              <w:ind w:left="788" w:firstLine="0"/>
               <w:jc w:val="left"/>
               <w:rPr>
                 <w:rFonts w:ascii="Segoe UI Symbol" w:eastAsia="Segoe UI Symbol" w:hAnsi="Segoe UI Symbol" w:cs="Segoe UI Symbol"/>
@@ -2862,7 +2862,7 @@
           </mc:Choice>
           <mc:Fallback>
             <w:pict>
-              <v:group w14:anchorId="6EE04A74" id="Group 3312" o:spid="_x0000_s1026" style="width:337.65pt;height:.5pt;mso-position-horizontal-relative:char;mso-position-vertical-relative:line" coordsize="42879,60" o:gfxdata="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">
+              <v:group w14:anchorId="6E884275" id="Group 3312" o:spid="_x0000_s1026" style="width:337.65pt;height:.5pt;mso-position-horizontal-relative:char;mso-position-vertical-relative:line" coordsize="42879,60" o:gfxdata="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">
                 <v:shape id="Shape 5975" o:spid="_x0000_s1027" style="position:absolute;width:42879;height:91;visibility:visible;mso-wrap-style:square;v-text-anchor:top" coordsize="4287901,9144" o:gfxdata="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" path="m,l4287901,r,9144l,9144,,e" fillcolor="#7f7f7f" stroked="f" strokeweight="0">
                   <v:stroke miterlimit="83231f" joinstyle="miter"/>
                   <v:path arrowok="t" textboxrect="0,0,4287901,9144"/>
@@ -3502,7 +3502,7 @@
           </mc:Choice>
           <mc:Fallback>
             <w:pict>
-              <v:group w14:anchorId="634239D5" id="Group 3311" o:spid="_x0000_s1026" style="width:337.65pt;height:.5pt;mso-position-horizontal-relative:char;mso-position-vertical-relative:line" coordsize="42879,60" o:gfxdata="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">
+              <v:group w14:anchorId="725EA839" id="Group 3311" o:spid="_x0000_s1026" style="width:337.65pt;height:.5pt;mso-position-horizontal-relative:char;mso-position-vertical-relative:line" coordsize="42879,60" o:gfxdata="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">
                 <v:shape id="Shape 5977" o:spid="_x0000_s1027" style="position:absolute;width:42879;height:91;visibility:visible;mso-wrap-style:square;v-text-anchor:top" coordsize="4287901,9144" o:gfxdata="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" path="m,l4287901,r,9144l,9144,,e" fillcolor="#7f7f7f" stroked="f" strokeweight="0">
                   <v:stroke miterlimit="83231f" joinstyle="miter"/>
                   <v:path arrowok="t" textboxrect="0,0,4287901,9144"/>
@@ -4214,6 +4214,7 @@
   <w:style w:type="character" w:default="1" w:styleId="DefaultParagraphFont">
     <w:name w:val="Default Paragraph Font"/>
     <w:uiPriority w:val="1"/>
+    <w:semiHidden/>
     <w:unhideWhenUsed/>
   </w:style>
   <w:style w:type="table" w:default="1" w:styleId="TableNormal">
@@ -4271,6 +4272,18 @@
       <w:ind w:left="720"/>
       <w:contextualSpacing/>
     </w:pPr>
+  </w:style>
+  <w:style w:type="character" w:styleId="SubtleEmphasis">
+    <w:name w:val="Subtle Emphasis"/>
+    <w:basedOn w:val="DefaultParagraphFont"/>
+    <w:uiPriority w:val="19"/>
+    <w:qFormat/>
+    <w:rsid w:val="0009286E"/>
+    <w:rPr>
+      <w:i/>
+      <w:iCs/>
+      <w:color w:val="404040" w:themeColor="text1" w:themeTint="BF"/>
+    </w:rPr>
   </w:style>
 </w:styles>
 </file>

</xml_diff>

<commit_message>
Update Daniela resume and remove temp file
Replace assets/Daniela-Resume_23_01_26.docx with an updated binary and remove the temporary Office lock file assets/~$niela-Resume_23_01_26.docx to clean up leftover artifacts.
</commit_message>
<xml_diff>
--- a/assets/Daniela-Resume_23_01_26.docx
+++ b/assets/Daniela-Resume_23_01_26.docx
@@ -2862,7 +2862,7 @@
           </mc:Choice>
           <mc:Fallback>
             <w:pict>
-              <v:group w14:anchorId="6E884275" id="Group 3312" o:spid="_x0000_s1026" style="width:337.65pt;height:.5pt;mso-position-horizontal-relative:char;mso-position-vertical-relative:line" coordsize="42879,60" o:gfxdata="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">
+              <v:group w14:anchorId="5796AFAF" id="Group 3312" o:spid="_x0000_s1026" style="width:337.65pt;height:.5pt;mso-position-horizontal-relative:char;mso-position-vertical-relative:line" coordsize="42879,60" o:gfxdata="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">
                 <v:shape id="Shape 5975" o:spid="_x0000_s1027" style="position:absolute;width:42879;height:91;visibility:visible;mso-wrap-style:square;v-text-anchor:top" coordsize="4287901,9144" o:gfxdata="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" path="m,l4287901,r,9144l,9144,,e" fillcolor="#7f7f7f" stroked="f" strokeweight="0">
                   <v:stroke miterlimit="83231f" joinstyle="miter"/>
                   <v:path arrowok="t" textboxrect="0,0,4287901,9144"/>
@@ -3007,6 +3007,9 @@
         <w:spacing w:after="99" w:line="259" w:lineRule="auto"/>
         <w:ind w:left="-15" w:firstLine="0"/>
         <w:jc w:val="left"/>
+        <w:rPr>
+          <w:szCs w:val="22"/>
+        </w:rPr>
       </w:pPr>
       <w:r>
         <w:rPr>
@@ -3019,6 +3022,12 @@
           <w:b/>
         </w:rPr>
         <w:tab/>
+      </w:r>
+      <w:r>
+        <w:rPr>
+          <w:b/>
+          <w:szCs w:val="22"/>
+        </w:rPr>
         <w:t xml:space="preserve">Programming &amp; Development: </w:t>
       </w:r>
     </w:p>
@@ -3030,34 +3039,54 @@
         </w:numPr>
         <w:spacing w:after="8"/>
         <w:ind w:right="150" w:hanging="360"/>
+        <w:rPr>
+          <w:szCs w:val="22"/>
+        </w:rPr>
       </w:pPr>
       <w:r>
+        <w:rPr>
+          <w:szCs w:val="22"/>
+        </w:rPr>
         <w:t xml:space="preserve">Python (FastAPI, boto3) – </w:t>
       </w:r>
       <w:r>
         <w:rPr>
           <w:i/>
+          <w:szCs w:val="22"/>
         </w:rPr>
         <w:t>Beginner/Intermediate</w:t>
       </w:r>
       <w:r>
+        <w:rPr>
+          <w:szCs w:val="22"/>
+        </w:rPr>
         <w:t xml:space="preserve"> </w:t>
       </w:r>
     </w:p>
     <w:p>
       <w:pPr>
         <w:ind w:left="2711"/>
+        <w:rPr>
+          <w:szCs w:val="22"/>
+        </w:rPr>
       </w:pPr>
       <w:r>
+        <w:rPr>
+          <w:szCs w:val="22"/>
+        </w:rPr>
         <w:t xml:space="preserve">JavaScript (ES6+, TypeScript) – </w:t>
       </w:r>
       <w:r>
         <w:rPr>
           <w:i/>
+          <w:szCs w:val="22"/>
         </w:rPr>
         <w:t>Beginner/Intermediate</w:t>
       </w:r>
       <w:r>
+        <w:rPr>
+          <w:szCs w:val="22"/>
+        </w:rPr>
         <w:t xml:space="preserve"> </w:t>
       </w:r>
     </w:p>
@@ -3069,17 +3098,27 @@
         </w:numPr>
         <w:spacing w:after="99" w:line="259" w:lineRule="auto"/>
         <w:ind w:right="150" w:hanging="360"/>
+        <w:rPr>
+          <w:szCs w:val="22"/>
+        </w:rPr>
       </w:pPr>
       <w:r>
+        <w:rPr>
+          <w:szCs w:val="22"/>
+        </w:rPr>
         <w:t xml:space="preserve">PHP – </w:t>
       </w:r>
       <w:r>
         <w:rPr>
           <w:i/>
+          <w:szCs w:val="22"/>
         </w:rPr>
         <w:t>Beginner/Intermediate</w:t>
       </w:r>
       <w:r>
+        <w:rPr>
+          <w:szCs w:val="22"/>
+        </w:rPr>
         <w:t xml:space="preserve"> </w:t>
       </w:r>
     </w:p>
@@ -3091,17 +3130,27 @@
         </w:numPr>
         <w:spacing w:after="97" w:line="259" w:lineRule="auto"/>
         <w:ind w:right="150" w:hanging="360"/>
+        <w:rPr>
+          <w:szCs w:val="22"/>
+        </w:rPr>
       </w:pPr>
       <w:r>
+        <w:rPr>
+          <w:szCs w:val="22"/>
+        </w:rPr>
         <w:t xml:space="preserve">HTML5, CSS3 – </w:t>
       </w:r>
       <w:r>
         <w:rPr>
           <w:i/>
+          <w:szCs w:val="22"/>
         </w:rPr>
         <w:t>Intermediate/Advanced</w:t>
       </w:r>
       <w:r>
+        <w:rPr>
+          <w:szCs w:val="22"/>
+        </w:rPr>
         <w:t xml:space="preserve"> </w:t>
       </w:r>
     </w:p>
@@ -3113,22 +3162,33 @@
         </w:numPr>
         <w:spacing w:after="0" w:line="346" w:lineRule="auto"/>
         <w:ind w:right="150" w:hanging="360"/>
+        <w:rPr>
+          <w:szCs w:val="22"/>
+        </w:rPr>
       </w:pPr>
       <w:r>
+        <w:rPr>
+          <w:szCs w:val="22"/>
+        </w:rPr>
         <w:t xml:space="preserve">WordPress – </w:t>
       </w:r>
       <w:r>
         <w:rPr>
           <w:i/>
+          <w:szCs w:val="22"/>
         </w:rPr>
         <w:t>Beginner/Intermediate</w:t>
       </w:r>
       <w:r>
+        <w:rPr>
+          <w:szCs w:val="22"/>
+        </w:rPr>
         <w:t xml:space="preserve"> </w:t>
       </w:r>
       <w:r>
         <w:rPr>
           <w:b/>
+          <w:szCs w:val="22"/>
         </w:rPr>
         <w:t xml:space="preserve">Quality Assurance &amp; Testing: </w:t>
       </w:r>
@@ -3140,17 +3200,27 @@
           <w:numId w:val="1"/>
         </w:numPr>
         <w:ind w:right="150" w:hanging="360"/>
+        <w:rPr>
+          <w:szCs w:val="22"/>
+        </w:rPr>
       </w:pPr>
       <w:r>
+        <w:rPr>
+          <w:szCs w:val="22"/>
+        </w:rPr>
         <w:t xml:space="preserve">Functional &amp; Non-functional Testing – </w:t>
       </w:r>
       <w:r>
         <w:rPr>
           <w:i/>
+          <w:szCs w:val="22"/>
         </w:rPr>
         <w:t>Beginner/Intermediate</w:t>
       </w:r>
       <w:r>
+        <w:rPr>
+          <w:szCs w:val="22"/>
+        </w:rPr>
         <w:t xml:space="preserve"> </w:t>
       </w:r>
     </w:p>
@@ -3161,17 +3231,27 @@
           <w:numId w:val="1"/>
         </w:numPr>
         <w:ind w:right="150" w:hanging="360"/>
+        <w:rPr>
+          <w:szCs w:val="22"/>
+        </w:rPr>
       </w:pPr>
       <w:r>
+        <w:rPr>
+          <w:szCs w:val="22"/>
+        </w:rPr>
         <w:t xml:space="preserve">Unit, Integration, System, Acceptance Testing – </w:t>
       </w:r>
       <w:r>
         <w:rPr>
           <w:i/>
+          <w:szCs w:val="22"/>
         </w:rPr>
         <w:t>Beginner/Intermediate</w:t>
       </w:r>
       <w:r>
+        <w:rPr>
+          <w:szCs w:val="22"/>
+        </w:rPr>
         <w:t xml:space="preserve"> </w:t>
       </w:r>
     </w:p>
@@ -3182,17 +3262,27 @@
           <w:numId w:val="1"/>
         </w:numPr>
         <w:ind w:right="150" w:hanging="360"/>
+        <w:rPr>
+          <w:szCs w:val="22"/>
+        </w:rPr>
       </w:pPr>
       <w:r>
+        <w:rPr>
+          <w:szCs w:val="22"/>
+        </w:rPr>
         <w:t xml:space="preserve">Test Case Design &amp; QA Planning – </w:t>
       </w:r>
       <w:r>
         <w:rPr>
           <w:i/>
+          <w:szCs w:val="22"/>
         </w:rPr>
         <w:t>Beginner/Intermediate</w:t>
       </w:r>
       <w:r>
+        <w:rPr>
+          <w:szCs w:val="22"/>
+        </w:rPr>
         <w:t xml:space="preserve"> </w:t>
       </w:r>
     </w:p>
@@ -3204,22 +3294,33 @@
         </w:numPr>
         <w:spacing w:after="0" w:line="347" w:lineRule="auto"/>
         <w:ind w:right="150" w:hanging="360"/>
+        <w:rPr>
+          <w:szCs w:val="22"/>
+        </w:rPr>
       </w:pPr>
       <w:r>
+        <w:rPr>
+          <w:szCs w:val="22"/>
+        </w:rPr>
         <w:t xml:space="preserve">Bug Reporting – </w:t>
       </w:r>
       <w:r>
         <w:rPr>
           <w:i/>
+          <w:szCs w:val="22"/>
         </w:rPr>
         <w:t>Beginner/Intermediate</w:t>
       </w:r>
       <w:r>
+        <w:rPr>
+          <w:szCs w:val="22"/>
+        </w:rPr>
         <w:t xml:space="preserve"> </w:t>
       </w:r>
       <w:r>
         <w:rPr>
           <w:b/>
+          <w:szCs w:val="22"/>
         </w:rPr>
         <w:t xml:space="preserve">Cloud &amp; DevOps: </w:t>
       </w:r>
@@ -3231,17 +3332,27 @@
           <w:numId w:val="1"/>
         </w:numPr>
         <w:ind w:right="150" w:hanging="360"/>
+        <w:rPr>
+          <w:szCs w:val="22"/>
+        </w:rPr>
       </w:pPr>
       <w:r>
+        <w:rPr>
+          <w:szCs w:val="22"/>
+        </w:rPr>
         <w:t xml:space="preserve">AWS (Lambda, S3, API Gateway, IAM, CloudWatch) – </w:t>
       </w:r>
       <w:r>
         <w:rPr>
           <w:i/>
+          <w:szCs w:val="22"/>
         </w:rPr>
         <w:t>Beginner</w:t>
       </w:r>
       <w:r>
+        <w:rPr>
+          <w:szCs w:val="22"/>
+        </w:rPr>
         <w:t xml:space="preserve"> </w:t>
       </w:r>
     </w:p>
@@ -3253,17 +3364,27 @@
         </w:numPr>
         <w:spacing w:after="97" w:line="259" w:lineRule="auto"/>
         <w:ind w:right="150" w:hanging="360"/>
+        <w:rPr>
+          <w:szCs w:val="22"/>
+        </w:rPr>
       </w:pPr>
       <w:r>
+        <w:rPr>
+          <w:szCs w:val="22"/>
+        </w:rPr>
         <w:t xml:space="preserve">Docker – </w:t>
       </w:r>
       <w:r>
         <w:rPr>
           <w:i/>
+          <w:szCs w:val="22"/>
         </w:rPr>
         <w:t>Beginner</w:t>
       </w:r>
       <w:r>
+        <w:rPr>
+          <w:szCs w:val="22"/>
+        </w:rPr>
         <w:t xml:space="preserve"> </w:t>
       </w:r>
     </w:p>
@@ -3275,23 +3396,33 @@
         </w:numPr>
         <w:spacing w:after="23"/>
         <w:ind w:right="150" w:hanging="360"/>
+        <w:rPr>
+          <w:szCs w:val="22"/>
+        </w:rPr>
       </w:pPr>
       <w:r>
+        <w:rPr>
+          <w:szCs w:val="22"/>
+        </w:rPr>
         <w:t xml:space="preserve">Git/GitHub, CI/CD (GitHub Actions) – </w:t>
       </w:r>
       <w:r>
         <w:rPr>
           <w:i/>
+          <w:szCs w:val="22"/>
         </w:rPr>
         <w:t>Beginner/Intermediate</w:t>
       </w:r>
       <w:r>
+        <w:rPr>
+          <w:szCs w:val="22"/>
+        </w:rPr>
         <w:t xml:space="preserve"> </w:t>
       </w:r>
       <w:r>
         <w:rPr>
           <w:b/>
-          <w:sz w:val="28"/>
+          <w:szCs w:val="22"/>
         </w:rPr>
         <w:t xml:space="preserve">Tools &amp; Frameworks </w:t>
       </w:r>
@@ -3304,17 +3435,27 @@
         </w:numPr>
         <w:spacing w:after="99" w:line="259" w:lineRule="auto"/>
         <w:ind w:right="150" w:hanging="360"/>
+        <w:rPr>
+          <w:szCs w:val="22"/>
+        </w:rPr>
       </w:pPr>
       <w:r>
+        <w:rPr>
+          <w:szCs w:val="22"/>
+        </w:rPr>
         <w:t xml:space="preserve">Postman – </w:t>
       </w:r>
       <w:r>
         <w:rPr>
           <w:i/>
+          <w:szCs w:val="22"/>
         </w:rPr>
         <w:t>Beginner/Intermediate</w:t>
       </w:r>
       <w:r>
+        <w:rPr>
+          <w:szCs w:val="22"/>
+        </w:rPr>
         <w:t xml:space="preserve"> </w:t>
       </w:r>
     </w:p>
@@ -3326,17 +3467,27 @@
         </w:numPr>
         <w:spacing w:after="99" w:line="259" w:lineRule="auto"/>
         <w:ind w:right="150" w:hanging="360"/>
+        <w:rPr>
+          <w:szCs w:val="22"/>
+        </w:rPr>
       </w:pPr>
       <w:r>
+        <w:rPr>
+          <w:szCs w:val="22"/>
+        </w:rPr>
         <w:t xml:space="preserve">Pytest – </w:t>
       </w:r>
       <w:r>
         <w:rPr>
           <w:i/>
+          <w:szCs w:val="22"/>
         </w:rPr>
         <w:t>Beginner/Intermediate</w:t>
       </w:r>
       <w:r>
+        <w:rPr>
+          <w:szCs w:val="22"/>
+        </w:rPr>
         <w:t xml:space="preserve"> </w:t>
       </w:r>
     </w:p>
@@ -3348,17 +3499,27 @@
         </w:numPr>
         <w:spacing w:after="310" w:line="259" w:lineRule="auto"/>
         <w:ind w:right="150" w:hanging="360"/>
+        <w:rPr>
+          <w:szCs w:val="22"/>
+        </w:rPr>
       </w:pPr>
       <w:r>
+        <w:rPr>
+          <w:szCs w:val="22"/>
+        </w:rPr>
         <w:t xml:space="preserve">Microsoft Word &amp; Excel – </w:t>
       </w:r>
       <w:r>
         <w:rPr>
           <w:i/>
+          <w:szCs w:val="22"/>
         </w:rPr>
         <w:t>Advanced</w:t>
       </w:r>
       <w:r>
+        <w:rPr>
+          <w:szCs w:val="22"/>
+        </w:rPr>
         <w:t xml:space="preserve"> </w:t>
       </w:r>
     </w:p>
@@ -3404,124 +3565,16 @@
         <w:spacing w:after="1017" w:line="259" w:lineRule="auto"/>
         <w:ind w:left="0" w:firstLine="0"/>
         <w:jc w:val="left"/>
+        <w:rPr>
+          <w:lang w:val="pt-PT"/>
+        </w:rPr>
       </w:pPr>
       <w:r>
+        <w:rPr>
+          <w:lang w:val="pt-PT"/>
+        </w:rPr>
         <w:t xml:space="preserve"> </w:t>
       </w:r>
-    </w:p>
-    <w:p>
-      <w:pPr>
-        <w:spacing w:after="127" w:line="259" w:lineRule="auto"/>
-        <w:ind w:left="1555" w:right="-76" w:firstLine="0"/>
-        <w:jc w:val="left"/>
-      </w:pPr>
-      <w:r>
-        <w:rPr>
-          <w:rFonts w:ascii="Calibri" w:eastAsia="Calibri" w:hAnsi="Calibri" w:cs="Calibri"/>
-          <w:noProof/>
-        </w:rPr>
-        <mc:AlternateContent>
-          <mc:Choice Requires="wpg">
-            <w:drawing>
-              <wp:inline distT="0" distB="0" distL="0" distR="0" wp14:anchorId="034B54E4" wp14:editId="7C046333">
-                <wp:extent cx="4287901" cy="6096"/>
-                <wp:effectExtent l="0" t="0" r="0" b="0"/>
-                <wp:docPr id="3311" name="Group 3311"/>
-                <wp:cNvGraphicFramePr/>
-                <a:graphic xmlns:a="http://schemas.openxmlformats.org/drawingml/2006/main">
-                  <a:graphicData uri="http://schemas.microsoft.com/office/word/2010/wordprocessingGroup">
-                    <wpg:wgp>
-                      <wpg:cNvGrpSpPr/>
-                      <wpg:grpSpPr>
-                        <a:xfrm>
-                          <a:off x="0" y="0"/>
-                          <a:ext cx="4287901" cy="6096"/>
-                          <a:chOff x="0" y="0"/>
-                          <a:chExt cx="4287901" cy="6096"/>
-                        </a:xfrm>
-                      </wpg:grpSpPr>
-                      <wps:wsp>
-                        <wps:cNvPr id="5977" name="Shape 5977"/>
-                        <wps:cNvSpPr/>
-                        <wps:spPr>
-                          <a:xfrm>
-                            <a:off x="0" y="0"/>
-                            <a:ext cx="4287901" cy="9144"/>
-                          </a:xfrm>
-                          <a:custGeom>
-                            <a:avLst/>
-                            <a:gdLst/>
-                            <a:ahLst/>
-                            <a:cxnLst/>
-                            <a:rect l="0" t="0" r="0" b="0"/>
-                            <a:pathLst>
-                              <a:path w="4287901" h="9144">
-                                <a:moveTo>
-                                  <a:pt x="0" y="0"/>
-                                </a:moveTo>
-                                <a:lnTo>
-                                  <a:pt x="4287901" y="0"/>
-                                </a:lnTo>
-                                <a:lnTo>
-                                  <a:pt x="4287901" y="9144"/>
-                                </a:lnTo>
-                                <a:lnTo>
-                                  <a:pt x="0" y="9144"/>
-                                </a:lnTo>
-                                <a:lnTo>
-                                  <a:pt x="0" y="0"/>
-                                </a:lnTo>
-                              </a:path>
-                            </a:pathLst>
-                          </a:custGeom>
-                          <a:ln w="0" cap="flat">
-                            <a:miter lim="127000"/>
-                          </a:ln>
-                        </wps:spPr>
-                        <wps:style>
-                          <a:lnRef idx="0">
-                            <a:srgbClr val="000000">
-                              <a:alpha val="0"/>
-                            </a:srgbClr>
-                          </a:lnRef>
-                          <a:fillRef idx="1">
-                            <a:srgbClr val="7F7F7F"/>
-                          </a:fillRef>
-                          <a:effectRef idx="0">
-                            <a:scrgbClr r="0" g="0" b="0"/>
-                          </a:effectRef>
-                          <a:fontRef idx="none"/>
-                        </wps:style>
-                        <wps:bodyPr/>
-                      </wps:wsp>
-                    </wpg:wgp>
-                  </a:graphicData>
-                </a:graphic>
-              </wp:inline>
-            </w:drawing>
-          </mc:Choice>
-          <mc:Fallback>
-            <w:pict>
-              <v:group w14:anchorId="725EA839" id="Group 3311" o:spid="_x0000_s1026" style="width:337.65pt;height:.5pt;mso-position-horizontal-relative:char;mso-position-vertical-relative:line" coordsize="42879,60" o:gfxdata="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">
-                <v:shape id="Shape 5977" o:spid="_x0000_s1027" style="position:absolute;width:42879;height:91;visibility:visible;mso-wrap-style:square;v-text-anchor:top" coordsize="4287901,9144" o:gfxdata="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" path="m,l4287901,r,9144l,9144,,e" fillcolor="#7f7f7f" stroked="f" strokeweight="0">
-                  <v:stroke miterlimit="83231f" joinstyle="miter"/>
-                  <v:path arrowok="t" textboxrect="0,0,4287901,9144"/>
-                </v:shape>
-                <w10:anchorlock/>
-              </v:group>
-            </w:pict>
-          </mc:Fallback>
-        </mc:AlternateContent>
-      </w:r>
-    </w:p>
-    <w:p>
-      <w:pPr>
-        <w:spacing w:after="45"/>
-        <w:ind w:left="1553" w:hanging="1553"/>
-        <w:rPr>
-          <w:lang w:val="pt-PT"/>
-        </w:rPr>
-      </w:pPr>
       <w:r>
         <w:rPr>
           <w:lang w:val="pt-PT"/>

</xml_diff>

<commit_message>
Add WhatsApp contact, adjust nav and translations
Add a WhatsApp contact chip to the contact form (link to +351 962 046 821) and include corresponding translation keys in English and Portuguese. Update CSS to add spacing for stacked contact lines and change .topbar .nav alignment from center to end. Also update resume assets (PDF and DOCX). These changes expose WhatsApp as a contact option and tweak layout/labels accordingly.
</commit_message>
<xml_diff>
--- a/assets/Daniela-Resume_23_01_26.docx
+++ b/assets/Daniela-Resume_23_01_26.docx
@@ -22,7 +22,19 @@
         <w:rPr>
           <w:lang w:val="pt-PT"/>
         </w:rPr>
-        <w:t xml:space="preserve">Daniela Torres Almeida, Cascais, Portugal danielarosadolealtorresalmeida@gmail.com </w:t>
+        <w:t xml:space="preserve">Daniela Torres Almeida, Cascais, Portugal </w:t>
+      </w:r>
+      <w:r>
+        <w:rPr>
+          <w:lang w:val="pt-PT"/>
+        </w:rPr>
+        <w:t>danielarosadolealtorresalmeida@gmail.com | WhatsApp: +351 962 046 821</w:t>
+      </w:r>
+      <w:r>
+        <w:rPr>
+          <w:lang w:val="pt-PT"/>
+        </w:rPr>
+        <w:t xml:space="preserve"> </w:t>
       </w:r>
     </w:p>
     <w:tbl>
@@ -540,7 +552,6 @@
             <w:r>
               <w:t xml:space="preserve">Software Development Intern </w:t>
             </w:r>
-            <w:proofErr w:type="spellStart"/>
             <w:r>
               <w:rPr>
                 <w:i/>
@@ -559,7 +570,6 @@
               </w:rPr>
               <w:t>Labs</w:t>
             </w:r>
-            <w:proofErr w:type="spellEnd"/>
             <w:r>
               <w:rPr>
                 <w:i/>
@@ -2105,11 +2115,9 @@
               </w:rPr>
               <w:t xml:space="preserve"> -</w:t>
             </w:r>
-            <w:proofErr w:type="spellStart"/>
             <w:r>
               <w:t>FreeCodeCamp</w:t>
             </w:r>
-            <w:proofErr w:type="spellEnd"/>
           </w:p>
           <w:p>
             <w:pPr>
@@ -2893,7 +2901,24 @@
           <w:lang w:val="pt-PT"/>
         </w:rPr>
         <w:tab/>
-        <w:t xml:space="preserve">Daniela Torres Almeida, Cascais, Portugal danielarosadolealtorresalmeida@gmail.com </w:t>
+      </w:r>
+      <w:r>
+        <w:rPr>
+          <w:lang w:val="pt-PT"/>
+        </w:rPr>
+        <w:t xml:space="preserve">Daniela Torres Almeida, Cascais, Portugal </w:t>
+      </w:r>
+      <w:r>
+        <w:rPr>
+          <w:lang w:val="pt-PT"/>
+        </w:rPr>
+        <w:t>danielarosadolealtorresalmeida@gmail.com | WhatsApp: +351 962 046 821</w:t>
+      </w:r>
+      <w:r>
+        <w:rPr>
+          <w:lang w:val="pt-PT"/>
+        </w:rPr>
+        <w:t xml:space="preserve"> </w:t>
       </w:r>
     </w:p>
     <w:p>
@@ -3547,7 +3572,6 @@
         <w:rPr>
           <w:b/>
         </w:rPr>
-        <w:lastRenderedPageBreak/>
         <w:t xml:space="preserve"> </w:t>
       </w:r>
       <w:r>
@@ -3586,7 +3610,19 @@
           <w:lang w:val="pt-PT"/>
         </w:rPr>
         <w:tab/>
-        <w:t xml:space="preserve">Daniela Torres Almeida, Cascais, Portugal danielarosadolealtorresalmeida@gmail.com </w:t>
+        <w:t xml:space="preserve">Daniela Torres Almeida, Cascais, Portugal </w:t>
+      </w:r>
+      <w:r>
+        <w:rPr>
+          <w:lang w:val="pt-PT"/>
+        </w:rPr>
+        <w:t>danielarosadolealtorresalmeida@gmail.com | WhatsApp: +351 962 046 821</w:t>
+      </w:r>
+      <w:r>
+        <w:rPr>
+          <w:lang w:val="pt-PT"/>
+        </w:rPr>
+        <w:t xml:space="preserve"> </w:t>
       </w:r>
     </w:p>
     <w:p>
@@ -3606,12 +3642,128 @@
       </w:r>
     </w:p>
     <w:sectPr>
+      <w:headerReference w:type="even" r:id="rId7"/>
+      <w:headerReference w:type="default" r:id="rId8"/>
+      <w:footerReference w:type="even" r:id="rId9"/>
+      <w:footerReference w:type="default" r:id="rId10"/>
+      <w:headerReference w:type="first" r:id="rId11"/>
+      <w:footerReference w:type="first" r:id="rId12"/>
       <w:pgSz w:w="11906" w:h="16838"/>
       <w:pgMar w:top="919" w:right="1874" w:bottom="573" w:left="1800" w:header="720" w:footer="720" w:gutter="0"/>
       <w:cols w:space="720"/>
     </w:sectPr>
   </w:body>
 </w:document>
+</file>
+
+<file path=word/endnotes.xml><?xml version="1.0" encoding="utf-8"?>
+<w:endnotes xmlns:wpc="http://schemas.microsoft.com/office/word/2010/wordprocessingCanvas" xmlns:cx="http://schemas.microsoft.com/office/drawing/2014/chartex" xmlns:cx1="http://schemas.microsoft.com/office/drawing/2015/9/8/chartex" xmlns:cx2="http://schemas.microsoft.com/office/drawing/2015/10/21/chartex" xmlns:cx3="http://schemas.microsoft.com/office/drawing/2016/5/9/chartex" xmlns:cx4="http://schemas.microsoft.com/office/drawing/2016/5/10/chartex" xmlns:cx5="http://schemas.microsoft.com/office/drawing/2016/5/11/chartex" xmlns:cx6="http://schemas.microsoft.com/office/drawing/2016/5/12/chartex" xmlns:cx7="http://schemas.microsoft.com/office/drawing/2016/5/13/chartex" xmlns:cx8="http://schemas.microsoft.com/office/drawing/2016/5/14/chartex" xmlns:mc="http://schemas.openxmlformats.org/markup-compatibility/2006" xmlns:aink="http://schemas.microsoft.com/office/drawing/2016/ink" xmlns:am3d="http://schemas.microsoft.com/office/drawing/2017/model3d" xmlns:o="urn:schemas-microsoft-com:office:office" xmlns:oel="http://schemas.microsoft.com/office/2019/extlst" xmlns:r="http://schemas.openxmlformats.org/officeDocument/2006/relationships" xmlns:m="http://schemas.openxmlformats.org/officeDocument/2006/math" xmlns:v="urn:schemas-microsoft-com:vml" xmlns:wp14="http://schemas.microsoft.com/office/word/2010/wordprocessingDrawing" xmlns:wp="http://schemas.openxmlformats.org/drawingml/2006/wordprocessingDrawing" xmlns:w10="urn:schemas-microsoft-com:office:word" xmlns:w="http://schemas.openxmlformats.org/wordprocessingml/2006/main" xmlns:w14="http://schemas.microsoft.com/office/word/2010/wordml" xmlns:w15="http://schemas.microsoft.com/office/word/2012/wordml" xmlns:w16cex="http://schemas.microsoft.com/office/word/2018/wordml/cex" xmlns:w16cid="http://schemas.microsoft.com/office/word/2016/wordml/cid" xmlns:w16="http://schemas.microsoft.com/office/word/2018/wordml" xmlns:w16du="http://schemas.microsoft.com/office/word/2023/wordml/word16du" xmlns:w16sdtdh="http://schemas.microsoft.com/office/word/2020/wordml/sdtdatahash" xmlns:w16sdtfl="http://schemas.microsoft.com/office/word/2024/wordml/sdtformatlock" xmlns:w16se="http://schemas.microsoft.com/office/word/2015/wordml/symex" xmlns:wpg="http://schemas.microsoft.com/office/word/2010/wordprocessingGroup" xmlns:wpi="http://schemas.microsoft.com/office/word/2010/wordprocessingInk" xmlns:wne="http://schemas.microsoft.com/office/word/2006/wordml" xmlns:wps="http://schemas.microsoft.com/office/word/2010/wordprocessingShape" mc:Ignorable="w14 w15 w16se w16cid w16 w16cex w16sdtdh w16sdtfl w16du wp14">
+  <w:endnote w:type="separator" w:id="-1">
+    <w:p>
+      <w:pPr>
+        <w:spacing w:after="0" w:line="240" w:lineRule="auto"/>
+      </w:pPr>
+      <w:r>
+        <w:separator/>
+      </w:r>
+    </w:p>
+  </w:endnote>
+  <w:endnote w:type="continuationSeparator" w:id="0">
+    <w:p>
+      <w:pPr>
+        <w:spacing w:after="0" w:line="240" w:lineRule="auto"/>
+      </w:pPr>
+      <w:r>
+        <w:continuationSeparator/>
+      </w:r>
+    </w:p>
+  </w:endnote>
+</w:endnotes>
+</file>
+
+<file path=word/footer1.xml><?xml version="1.0" encoding="utf-8"?>
+<w:ftr xmlns:wpc="http://schemas.microsoft.com/office/word/2010/wordprocessingCanvas" xmlns:cx="http://schemas.microsoft.com/office/drawing/2014/chartex" xmlns:cx1="http://schemas.microsoft.com/office/drawing/2015/9/8/chartex" xmlns:cx2="http://schemas.microsoft.com/office/drawing/2015/10/21/chartex" xmlns:cx3="http://schemas.microsoft.com/office/drawing/2016/5/9/chartex" xmlns:cx4="http://schemas.microsoft.com/office/drawing/2016/5/10/chartex" xmlns:cx5="http://schemas.microsoft.com/office/drawing/2016/5/11/chartex" xmlns:cx6="http://schemas.microsoft.com/office/drawing/2016/5/12/chartex" xmlns:cx7="http://schemas.microsoft.com/office/drawing/2016/5/13/chartex" xmlns:cx8="http://schemas.microsoft.com/office/drawing/2016/5/14/chartex" xmlns:mc="http://schemas.openxmlformats.org/markup-compatibility/2006" xmlns:aink="http://schemas.microsoft.com/office/drawing/2016/ink" xmlns:am3d="http://schemas.microsoft.com/office/drawing/2017/model3d" xmlns:o="urn:schemas-microsoft-com:office:office" xmlns:oel="http://schemas.microsoft.com/office/2019/extlst" xmlns:r="http://schemas.openxmlformats.org/officeDocument/2006/relationships" xmlns:m="http://schemas.openxmlformats.org/officeDocument/2006/math" xmlns:v="urn:schemas-microsoft-com:vml" xmlns:wp14="http://schemas.microsoft.com/office/word/2010/wordprocessingDrawing" xmlns:wp="http://schemas.openxmlformats.org/drawingml/2006/wordprocessingDrawing" xmlns:w10="urn:schemas-microsoft-com:office:word" xmlns:w="http://schemas.openxmlformats.org/wordprocessingml/2006/main" xmlns:w14="http://schemas.microsoft.com/office/word/2010/wordml" xmlns:w15="http://schemas.microsoft.com/office/word/2012/wordml" xmlns:w16cex="http://schemas.microsoft.com/office/word/2018/wordml/cex" xmlns:w16cid="http://schemas.microsoft.com/office/word/2016/wordml/cid" xmlns:w16="http://schemas.microsoft.com/office/word/2018/wordml" xmlns:w16du="http://schemas.microsoft.com/office/word/2023/wordml/word16du" xmlns:w16sdtdh="http://schemas.microsoft.com/office/word/2020/wordml/sdtdatahash" xmlns:w16sdtfl="http://schemas.microsoft.com/office/word/2024/wordml/sdtformatlock" xmlns:w16se="http://schemas.microsoft.com/office/word/2015/wordml/symex" xmlns:wpg="http://schemas.microsoft.com/office/word/2010/wordprocessingGroup" xmlns:wpi="http://schemas.microsoft.com/office/word/2010/wordprocessingInk" xmlns:wne="http://schemas.microsoft.com/office/word/2006/wordml" xmlns:wps="http://schemas.microsoft.com/office/word/2010/wordprocessingShape" mc:Ignorable="w14 w15 w16se w16cid w16 w16cex w16sdtdh w16sdtfl w16du wp14">
+  <w:p>
+    <w:pPr>
+      <w:pStyle w:val="Footer"/>
+    </w:pPr>
+  </w:p>
+</w:ftr>
+</file>
+
+<file path=word/footer2.xml><?xml version="1.0" encoding="utf-8"?>
+<w:ftr xmlns:wpc="http://schemas.microsoft.com/office/word/2010/wordprocessingCanvas" xmlns:cx="http://schemas.microsoft.com/office/drawing/2014/chartex" xmlns:cx1="http://schemas.microsoft.com/office/drawing/2015/9/8/chartex" xmlns:cx2="http://schemas.microsoft.com/office/drawing/2015/10/21/chartex" xmlns:cx3="http://schemas.microsoft.com/office/drawing/2016/5/9/chartex" xmlns:cx4="http://schemas.microsoft.com/office/drawing/2016/5/10/chartex" xmlns:cx5="http://schemas.microsoft.com/office/drawing/2016/5/11/chartex" xmlns:cx6="http://schemas.microsoft.com/office/drawing/2016/5/12/chartex" xmlns:cx7="http://schemas.microsoft.com/office/drawing/2016/5/13/chartex" xmlns:cx8="http://schemas.microsoft.com/office/drawing/2016/5/14/chartex" xmlns:mc="http://schemas.openxmlformats.org/markup-compatibility/2006" xmlns:aink="http://schemas.microsoft.com/office/drawing/2016/ink" xmlns:am3d="http://schemas.microsoft.com/office/drawing/2017/model3d" xmlns:o="urn:schemas-microsoft-com:office:office" xmlns:oel="http://schemas.microsoft.com/office/2019/extlst" xmlns:r="http://schemas.openxmlformats.org/officeDocument/2006/relationships" xmlns:m="http://schemas.openxmlformats.org/officeDocument/2006/math" xmlns:v="urn:schemas-microsoft-com:vml" xmlns:wp14="http://schemas.microsoft.com/office/word/2010/wordprocessingDrawing" xmlns:wp="http://schemas.openxmlformats.org/drawingml/2006/wordprocessingDrawing" xmlns:w10="urn:schemas-microsoft-com:office:word" xmlns:w="http://schemas.openxmlformats.org/wordprocessingml/2006/main" xmlns:w14="http://schemas.microsoft.com/office/word/2010/wordml" xmlns:w15="http://schemas.microsoft.com/office/word/2012/wordml" xmlns:w16cex="http://schemas.microsoft.com/office/word/2018/wordml/cex" xmlns:w16cid="http://schemas.microsoft.com/office/word/2016/wordml/cid" xmlns:w16="http://schemas.microsoft.com/office/word/2018/wordml" xmlns:w16du="http://schemas.microsoft.com/office/word/2023/wordml/word16du" xmlns:w16sdtdh="http://schemas.microsoft.com/office/word/2020/wordml/sdtdatahash" xmlns:w16sdtfl="http://schemas.microsoft.com/office/word/2024/wordml/sdtformatlock" xmlns:w16se="http://schemas.microsoft.com/office/word/2015/wordml/symex" xmlns:wpg="http://schemas.microsoft.com/office/word/2010/wordprocessingGroup" xmlns:wpi="http://schemas.microsoft.com/office/word/2010/wordprocessingInk" xmlns:wne="http://schemas.microsoft.com/office/word/2006/wordml" xmlns:wps="http://schemas.microsoft.com/office/word/2010/wordprocessingShape" mc:Ignorable="w14 w15 w16se w16cid w16 w16cex w16sdtdh w16sdtfl w16du wp14">
+  <w:p>
+    <w:pPr>
+      <w:pStyle w:val="Footer"/>
+    </w:pPr>
+  </w:p>
+</w:ftr>
+</file>
+
+<file path=word/footer3.xml><?xml version="1.0" encoding="utf-8"?>
+<w:ftr xmlns:wpc="http://schemas.microsoft.com/office/word/2010/wordprocessingCanvas" xmlns:cx="http://schemas.microsoft.com/office/drawing/2014/chartex" xmlns:cx1="http://schemas.microsoft.com/office/drawing/2015/9/8/chartex" xmlns:cx2="http://schemas.microsoft.com/office/drawing/2015/10/21/chartex" xmlns:cx3="http://schemas.microsoft.com/office/drawing/2016/5/9/chartex" xmlns:cx4="http://schemas.microsoft.com/office/drawing/2016/5/10/chartex" xmlns:cx5="http://schemas.microsoft.com/office/drawing/2016/5/11/chartex" xmlns:cx6="http://schemas.microsoft.com/office/drawing/2016/5/12/chartex" xmlns:cx7="http://schemas.microsoft.com/office/drawing/2016/5/13/chartex" xmlns:cx8="http://schemas.microsoft.com/office/drawing/2016/5/14/chartex" xmlns:mc="http://schemas.openxmlformats.org/markup-compatibility/2006" xmlns:aink="http://schemas.microsoft.com/office/drawing/2016/ink" xmlns:am3d="http://schemas.microsoft.com/office/drawing/2017/model3d" xmlns:o="urn:schemas-microsoft-com:office:office" xmlns:oel="http://schemas.microsoft.com/office/2019/extlst" xmlns:r="http://schemas.openxmlformats.org/officeDocument/2006/relationships" xmlns:m="http://schemas.openxmlformats.org/officeDocument/2006/math" xmlns:v="urn:schemas-microsoft-com:vml" xmlns:wp14="http://schemas.microsoft.com/office/word/2010/wordprocessingDrawing" xmlns:wp="http://schemas.openxmlformats.org/drawingml/2006/wordprocessingDrawing" xmlns:w10="urn:schemas-microsoft-com:office:word" xmlns:w="http://schemas.openxmlformats.org/wordprocessingml/2006/main" xmlns:w14="http://schemas.microsoft.com/office/word/2010/wordml" xmlns:w15="http://schemas.microsoft.com/office/word/2012/wordml" xmlns:w16cex="http://schemas.microsoft.com/office/word/2018/wordml/cex" xmlns:w16cid="http://schemas.microsoft.com/office/word/2016/wordml/cid" xmlns:w16="http://schemas.microsoft.com/office/word/2018/wordml" xmlns:w16du="http://schemas.microsoft.com/office/word/2023/wordml/word16du" xmlns:w16sdtdh="http://schemas.microsoft.com/office/word/2020/wordml/sdtdatahash" xmlns:w16sdtfl="http://schemas.microsoft.com/office/word/2024/wordml/sdtformatlock" xmlns:w16se="http://schemas.microsoft.com/office/word/2015/wordml/symex" xmlns:wpg="http://schemas.microsoft.com/office/word/2010/wordprocessingGroup" xmlns:wpi="http://schemas.microsoft.com/office/word/2010/wordprocessingInk" xmlns:wne="http://schemas.microsoft.com/office/word/2006/wordml" xmlns:wps="http://schemas.microsoft.com/office/word/2010/wordprocessingShape" mc:Ignorable="w14 w15 w16se w16cid w16 w16cex w16sdtdh w16sdtfl w16du wp14">
+  <w:p>
+    <w:pPr>
+      <w:pStyle w:val="Footer"/>
+    </w:pPr>
+  </w:p>
+</w:ftr>
+</file>
+
+<file path=word/footnotes.xml><?xml version="1.0" encoding="utf-8"?>
+<w:footnotes xmlns:wpc="http://schemas.microsoft.com/office/word/2010/wordprocessingCanvas" xmlns:cx="http://schemas.microsoft.com/office/drawing/2014/chartex" xmlns:cx1="http://schemas.microsoft.com/office/drawing/2015/9/8/chartex" xmlns:cx2="http://schemas.microsoft.com/office/drawing/2015/10/21/chartex" xmlns:cx3="http://schemas.microsoft.com/office/drawing/2016/5/9/chartex" xmlns:cx4="http://schemas.microsoft.com/office/drawing/2016/5/10/chartex" xmlns:cx5="http://schemas.microsoft.com/office/drawing/2016/5/11/chartex" xmlns:cx6="http://schemas.microsoft.com/office/drawing/2016/5/12/chartex" xmlns:cx7="http://schemas.microsoft.com/office/drawing/2016/5/13/chartex" xmlns:cx8="http://schemas.microsoft.com/office/drawing/2016/5/14/chartex" xmlns:mc="http://schemas.openxmlformats.org/markup-compatibility/2006" xmlns:aink="http://schemas.microsoft.com/office/drawing/2016/ink" xmlns:am3d="http://schemas.microsoft.com/office/drawing/2017/model3d" xmlns:o="urn:schemas-microsoft-com:office:office" xmlns:oel="http://schemas.microsoft.com/office/2019/extlst" xmlns:r="http://schemas.openxmlformats.org/officeDocument/2006/relationships" xmlns:m="http://schemas.openxmlformats.org/officeDocument/2006/math" xmlns:v="urn:schemas-microsoft-com:vml" xmlns:wp14="http://schemas.microsoft.com/office/word/2010/wordprocessingDrawing" xmlns:wp="http://schemas.openxmlformats.org/drawingml/2006/wordprocessingDrawing" xmlns:w10="urn:schemas-microsoft-com:office:word" xmlns:w="http://schemas.openxmlformats.org/wordprocessingml/2006/main" xmlns:w14="http://schemas.microsoft.com/office/word/2010/wordml" xmlns:w15="http://schemas.microsoft.com/office/word/2012/wordml" xmlns:w16cex="http://schemas.microsoft.com/office/word/2018/wordml/cex" xmlns:w16cid="http://schemas.microsoft.com/office/word/2016/wordml/cid" xmlns:w16="http://schemas.microsoft.com/office/word/2018/wordml" xmlns:w16du="http://schemas.microsoft.com/office/word/2023/wordml/word16du" xmlns:w16sdtdh="http://schemas.microsoft.com/office/word/2020/wordml/sdtdatahash" xmlns:w16sdtfl="http://schemas.microsoft.com/office/word/2024/wordml/sdtformatlock" xmlns:w16se="http://schemas.microsoft.com/office/word/2015/wordml/symex" xmlns:wpg="http://schemas.microsoft.com/office/word/2010/wordprocessingGroup" xmlns:wpi="http://schemas.microsoft.com/office/word/2010/wordprocessingInk" xmlns:wne="http://schemas.microsoft.com/office/word/2006/wordml" xmlns:wps="http://schemas.microsoft.com/office/word/2010/wordprocessingShape" mc:Ignorable="w14 w15 w16se w16cid w16 w16cex w16sdtdh w16sdtfl w16du wp14">
+  <w:footnote w:type="separator" w:id="-1">
+    <w:p>
+      <w:pPr>
+        <w:spacing w:after="0" w:line="240" w:lineRule="auto"/>
+      </w:pPr>
+      <w:r>
+        <w:separator/>
+      </w:r>
+    </w:p>
+  </w:footnote>
+  <w:footnote w:type="continuationSeparator" w:id="0">
+    <w:p>
+      <w:pPr>
+        <w:spacing w:after="0" w:line="240" w:lineRule="auto"/>
+      </w:pPr>
+      <w:r>
+        <w:continuationSeparator/>
+      </w:r>
+    </w:p>
+  </w:footnote>
+</w:footnotes>
+</file>
+
+<file path=word/header1.xml><?xml version="1.0" encoding="utf-8"?>
+<w:hdr xmlns:wpc="http://schemas.microsoft.com/office/word/2010/wordprocessingCanvas" xmlns:cx="http://schemas.microsoft.com/office/drawing/2014/chartex" xmlns:cx1="http://schemas.microsoft.com/office/drawing/2015/9/8/chartex" xmlns:cx2="http://schemas.microsoft.com/office/drawing/2015/10/21/chartex" xmlns:cx3="http://schemas.microsoft.com/office/drawing/2016/5/9/chartex" xmlns:cx4="http://schemas.microsoft.com/office/drawing/2016/5/10/chartex" xmlns:cx5="http://schemas.microsoft.com/office/drawing/2016/5/11/chartex" xmlns:cx6="http://schemas.microsoft.com/office/drawing/2016/5/12/chartex" xmlns:cx7="http://schemas.microsoft.com/office/drawing/2016/5/13/chartex" xmlns:cx8="http://schemas.microsoft.com/office/drawing/2016/5/14/chartex" xmlns:mc="http://schemas.openxmlformats.org/markup-compatibility/2006" xmlns:aink="http://schemas.microsoft.com/office/drawing/2016/ink" xmlns:am3d="http://schemas.microsoft.com/office/drawing/2017/model3d" xmlns:o="urn:schemas-microsoft-com:office:office" xmlns:oel="http://schemas.microsoft.com/office/2019/extlst" xmlns:r="http://schemas.openxmlformats.org/officeDocument/2006/relationships" xmlns:m="http://schemas.openxmlformats.org/officeDocument/2006/math" xmlns:v="urn:schemas-microsoft-com:vml" xmlns:wp14="http://schemas.microsoft.com/office/word/2010/wordprocessingDrawing" xmlns:wp="http://schemas.openxmlformats.org/drawingml/2006/wordprocessingDrawing" xmlns:w10="urn:schemas-microsoft-com:office:word" xmlns:w="http://schemas.openxmlformats.org/wordprocessingml/2006/main" xmlns:w14="http://schemas.microsoft.com/office/word/2010/wordml" xmlns:w15="http://schemas.microsoft.com/office/word/2012/wordml" xmlns:w16cex="http://schemas.microsoft.com/office/word/2018/wordml/cex" xmlns:w16cid="http://schemas.microsoft.com/office/word/2016/wordml/cid" xmlns:w16="http://schemas.microsoft.com/office/word/2018/wordml" xmlns:w16du="http://schemas.microsoft.com/office/word/2023/wordml/word16du" xmlns:w16sdtdh="http://schemas.microsoft.com/office/word/2020/wordml/sdtdatahash" xmlns:w16sdtfl="http://schemas.microsoft.com/office/word/2024/wordml/sdtformatlock" xmlns:w16se="http://schemas.microsoft.com/office/word/2015/wordml/symex" xmlns:wpg="http://schemas.microsoft.com/office/word/2010/wordprocessingGroup" xmlns:wpi="http://schemas.microsoft.com/office/word/2010/wordprocessingInk" xmlns:wne="http://schemas.microsoft.com/office/word/2006/wordml" xmlns:wps="http://schemas.microsoft.com/office/word/2010/wordprocessingShape" mc:Ignorable="w14 w15 w16se w16cid w16 w16cex w16sdtdh w16sdtfl w16du wp14">
+  <w:p>
+    <w:pPr>
+      <w:pStyle w:val="Header"/>
+    </w:pPr>
+  </w:p>
+</w:hdr>
+</file>
+
+<file path=word/header2.xml><?xml version="1.0" encoding="utf-8"?>
+<w:hdr xmlns:wpc="http://schemas.microsoft.com/office/word/2010/wordprocessingCanvas" xmlns:cx="http://schemas.microsoft.com/office/drawing/2014/chartex" xmlns:cx1="http://schemas.microsoft.com/office/drawing/2015/9/8/chartex" xmlns:cx2="http://schemas.microsoft.com/office/drawing/2015/10/21/chartex" xmlns:cx3="http://schemas.microsoft.com/office/drawing/2016/5/9/chartex" xmlns:cx4="http://schemas.microsoft.com/office/drawing/2016/5/10/chartex" xmlns:cx5="http://schemas.microsoft.com/office/drawing/2016/5/11/chartex" xmlns:cx6="http://schemas.microsoft.com/office/drawing/2016/5/12/chartex" xmlns:cx7="http://schemas.microsoft.com/office/drawing/2016/5/13/chartex" xmlns:cx8="http://schemas.microsoft.com/office/drawing/2016/5/14/chartex" xmlns:mc="http://schemas.openxmlformats.org/markup-compatibility/2006" xmlns:aink="http://schemas.microsoft.com/office/drawing/2016/ink" xmlns:am3d="http://schemas.microsoft.com/office/drawing/2017/model3d" xmlns:o="urn:schemas-microsoft-com:office:office" xmlns:oel="http://schemas.microsoft.com/office/2019/extlst" xmlns:r="http://schemas.openxmlformats.org/officeDocument/2006/relationships" xmlns:m="http://schemas.openxmlformats.org/officeDocument/2006/math" xmlns:v="urn:schemas-microsoft-com:vml" xmlns:wp14="http://schemas.microsoft.com/office/word/2010/wordprocessingDrawing" xmlns:wp="http://schemas.openxmlformats.org/drawingml/2006/wordprocessingDrawing" xmlns:w10="urn:schemas-microsoft-com:office:word" xmlns:w="http://schemas.openxmlformats.org/wordprocessingml/2006/main" xmlns:w14="http://schemas.microsoft.com/office/word/2010/wordml" xmlns:w15="http://schemas.microsoft.com/office/word/2012/wordml" xmlns:w16cex="http://schemas.microsoft.com/office/word/2018/wordml/cex" xmlns:w16cid="http://schemas.microsoft.com/office/word/2016/wordml/cid" xmlns:w16="http://schemas.microsoft.com/office/word/2018/wordml" xmlns:w16du="http://schemas.microsoft.com/office/word/2023/wordml/word16du" xmlns:w16sdtdh="http://schemas.microsoft.com/office/word/2020/wordml/sdtdatahash" xmlns:w16sdtfl="http://schemas.microsoft.com/office/word/2024/wordml/sdtformatlock" xmlns:w16se="http://schemas.microsoft.com/office/word/2015/wordml/symex" xmlns:wpg="http://schemas.microsoft.com/office/word/2010/wordprocessingGroup" xmlns:wpi="http://schemas.microsoft.com/office/word/2010/wordprocessingInk" xmlns:wne="http://schemas.microsoft.com/office/word/2006/wordml" xmlns:wps="http://schemas.microsoft.com/office/word/2010/wordprocessingShape" mc:Ignorable="w14 w15 w16se w16cid w16 w16cex w16sdtdh w16sdtfl w16du wp14">
+  <w:p>
+    <w:pPr>
+      <w:pStyle w:val="Header"/>
+    </w:pPr>
+  </w:p>
+</w:hdr>
+</file>
+
+<file path=word/header3.xml><?xml version="1.0" encoding="utf-8"?>
+<w:hdr xmlns:wpc="http://schemas.microsoft.com/office/word/2010/wordprocessingCanvas" xmlns:cx="http://schemas.microsoft.com/office/drawing/2014/chartex" xmlns:cx1="http://schemas.microsoft.com/office/drawing/2015/9/8/chartex" xmlns:cx2="http://schemas.microsoft.com/office/drawing/2015/10/21/chartex" xmlns:cx3="http://schemas.microsoft.com/office/drawing/2016/5/9/chartex" xmlns:cx4="http://schemas.microsoft.com/office/drawing/2016/5/10/chartex" xmlns:cx5="http://schemas.microsoft.com/office/drawing/2016/5/11/chartex" xmlns:cx6="http://schemas.microsoft.com/office/drawing/2016/5/12/chartex" xmlns:cx7="http://schemas.microsoft.com/office/drawing/2016/5/13/chartex" xmlns:cx8="http://schemas.microsoft.com/office/drawing/2016/5/14/chartex" xmlns:mc="http://schemas.openxmlformats.org/markup-compatibility/2006" xmlns:aink="http://schemas.microsoft.com/office/drawing/2016/ink" xmlns:am3d="http://schemas.microsoft.com/office/drawing/2017/model3d" xmlns:o="urn:schemas-microsoft-com:office:office" xmlns:oel="http://schemas.microsoft.com/office/2019/extlst" xmlns:r="http://schemas.openxmlformats.org/officeDocument/2006/relationships" xmlns:m="http://schemas.openxmlformats.org/officeDocument/2006/math" xmlns:v="urn:schemas-microsoft-com:vml" xmlns:wp14="http://schemas.microsoft.com/office/word/2010/wordprocessingDrawing" xmlns:wp="http://schemas.openxmlformats.org/drawingml/2006/wordprocessingDrawing" xmlns:w10="urn:schemas-microsoft-com:office:word" xmlns:w="http://schemas.openxmlformats.org/wordprocessingml/2006/main" xmlns:w14="http://schemas.microsoft.com/office/word/2010/wordml" xmlns:w15="http://schemas.microsoft.com/office/word/2012/wordml" xmlns:w16cex="http://schemas.microsoft.com/office/word/2018/wordml/cex" xmlns:w16cid="http://schemas.microsoft.com/office/word/2016/wordml/cid" xmlns:w16="http://schemas.microsoft.com/office/word/2018/wordml" xmlns:w16du="http://schemas.microsoft.com/office/word/2023/wordml/word16du" xmlns:w16sdtdh="http://schemas.microsoft.com/office/word/2020/wordml/sdtdatahash" xmlns:w16sdtfl="http://schemas.microsoft.com/office/word/2024/wordml/sdtformatlock" xmlns:w16se="http://schemas.microsoft.com/office/word/2015/wordml/symex" xmlns:wpg="http://schemas.microsoft.com/office/word/2010/wordprocessingGroup" xmlns:wpi="http://schemas.microsoft.com/office/word/2010/wordprocessingInk" xmlns:wne="http://schemas.microsoft.com/office/word/2006/wordml" xmlns:wps="http://schemas.microsoft.com/office/word/2010/wordprocessingShape" mc:Ignorable="w14 w15 w16se w16cid w16 w16cex w16sdtdh w16sdtfl w16du wp14">
+  <w:p>
+    <w:pPr>
+      <w:pStyle w:val="Header"/>
+    </w:pPr>
+  </w:p>
+</w:hdr>
 </file>
 
 <file path=word/numbering.xml><?xml version="1.0" encoding="utf-8"?>
@@ -4338,6 +4490,60 @@
       <w:color w:val="404040" w:themeColor="text1" w:themeTint="BF"/>
     </w:rPr>
   </w:style>
+  <w:style w:type="paragraph" w:styleId="Header">
+    <w:name w:val="header"/>
+    <w:basedOn w:val="Normal"/>
+    <w:link w:val="HeaderChar"/>
+    <w:uiPriority w:val="99"/>
+    <w:unhideWhenUsed/>
+    <w:rsid w:val="006738F3"/>
+    <w:pPr>
+      <w:tabs>
+        <w:tab w:val="center" w:pos="4252"/>
+        <w:tab w:val="right" w:pos="8504"/>
+      </w:tabs>
+      <w:spacing w:after="0" w:line="240" w:lineRule="auto"/>
+    </w:pPr>
+  </w:style>
+  <w:style w:type="character" w:customStyle="1" w:styleId="HeaderChar">
+    <w:name w:val="Header Char"/>
+    <w:basedOn w:val="DefaultParagraphFont"/>
+    <w:link w:val="Header"/>
+    <w:uiPriority w:val="99"/>
+    <w:rsid w:val="006738F3"/>
+    <w:rPr>
+      <w:rFonts w:ascii="Century Gothic" w:eastAsia="Century Gothic" w:hAnsi="Century Gothic" w:cs="Century Gothic"/>
+      <w:color w:val="000000"/>
+      <w:sz w:val="22"/>
+    </w:rPr>
+  </w:style>
+  <w:style w:type="paragraph" w:styleId="Footer">
+    <w:name w:val="footer"/>
+    <w:basedOn w:val="Normal"/>
+    <w:link w:val="FooterChar"/>
+    <w:uiPriority w:val="99"/>
+    <w:unhideWhenUsed/>
+    <w:rsid w:val="006738F3"/>
+    <w:pPr>
+      <w:tabs>
+        <w:tab w:val="center" w:pos="4252"/>
+        <w:tab w:val="right" w:pos="8504"/>
+      </w:tabs>
+      <w:spacing w:after="0" w:line="240" w:lineRule="auto"/>
+    </w:pPr>
+  </w:style>
+  <w:style w:type="character" w:customStyle="1" w:styleId="FooterChar">
+    <w:name w:val="Footer Char"/>
+    <w:basedOn w:val="DefaultParagraphFont"/>
+    <w:link w:val="Footer"/>
+    <w:uiPriority w:val="99"/>
+    <w:rsid w:val="006738F3"/>
+    <w:rPr>
+      <w:rFonts w:ascii="Century Gothic" w:eastAsia="Century Gothic" w:hAnsi="Century Gothic" w:cs="Century Gothic"/>
+      <w:color w:val="000000"/>
+      <w:sz w:val="22"/>
+    </w:rPr>
+  </w:style>
 </w:styles>
 </file>
 

</xml_diff>

<commit_message>
Add extracted resume files and update assets
Add unzipped DOCX contents under .tmp_docx_date (resume.zip and extracted Word parts) and include a temporary Office lockfile. Update resume assets (assets/Daniela-Resume.pdf and assets/Daniela-Resume_23_01_26.docx) and remove several obsolete screenshot/illustration images. Also apply edits to index.html and style.css.
</commit_message>
<xml_diff>
--- a/assets/Daniela-Resume_23_01_26.docx
+++ b/assets/Daniela-Resume_23_01_26.docx
@@ -583,7 +583,7 @@
               <w:t xml:space="preserve"> </w:t>
             </w:r>
             <w:r>
-              <w:t xml:space="preserve">| Sep </w:t>
+              <w:t xml:space="preserve">| Aug </w:t>
             </w:r>
           </w:p>
           <w:p>
@@ -2901,11 +2901,6 @@
           <w:lang w:val="pt-PT"/>
         </w:rPr>
         <w:tab/>
-      </w:r>
-      <w:r>
-        <w:rPr>
-          <w:lang w:val="pt-PT"/>
-        </w:rPr>
         <w:t xml:space="preserve">Daniela Torres Almeida, Cascais, Portugal </w:t>
       </w:r>
       <w:r>

</xml_diff>